<commit_message>
Add estimand specification and causal alignment guidance
</commit_message>
<xml_diff>
--- a/downloads/meeting-worksheet.docx
+++ b/downloads/meeting-worksheet.docx
@@ -8,9 +8,6 @@
         <w:pStyle w:val="Heading1"/>
       </w:pPr>
       <w:r>
-        <w:rPr>
-          <w:lang w:val="en-GB"/>
-        </w:rPr>
         <w:t xml:space="preserve">Triangulation meeting worksheet — draft v0.1</w:t>
       </w:r>
     </w:p>
@@ -19,9 +16,6 @@
         <w:pStyle w:val="FirstParagraph"/>
       </w:pPr>
       <w:r>
-        <w:rPr>
-          <w:lang w:val="en-GB"/>
-        </w:rPr>
         <w:t xml:space="preserve">Complete the blank tables and response spaces in Word. Keep the completed document with the meeting record. The Summary of Evidence table (SET) summarises the evidence; the assumption register records the assumptions and their rationale.</w:t>
       </w:r>
     </w:p>
@@ -31,9 +25,6 @@
         <w:pStyle w:val="Heading2"/>
       </w:pPr>
       <w:r>
-        <w:rPr>
-          <w:lang w:val="en-GB"/>
-        </w:rPr>
         <w:t xml:space="preserve">Session and provenance</w:t>
       </w:r>
     </w:p>
@@ -59,9 +50,6 @@
               <w:pStyle w:val="Compact"/>
             </w:pPr>
             <w:r>
-              <w:rPr>
-                <w:lang w:val="en-GB"/>
-              </w:rPr>
               <w:t xml:space="preserve">Field</w:t>
             </w:r>
           </w:p>
@@ -73,9 +61,6 @@
               <w:pStyle w:val="Compact"/>
             </w:pPr>
             <w:r>
-              <w:rPr>
-                <w:lang w:val="en-GB"/>
-              </w:rPr>
               <w:t xml:space="preserve">Response</w:t>
             </w:r>
           </w:p>
@@ -89,9 +74,6 @@
               <w:pStyle w:val="Compact"/>
             </w:pPr>
             <w:r>
-              <w:rPr>
-                <w:lang w:val="en-GB"/>
-              </w:rPr>
               <w:t xml:space="preserve">Project / review</w:t>
             </w:r>
           </w:p>
@@ -113,9 +95,6 @@
               <w:pStyle w:val="Compact"/>
             </w:pPr>
             <w:r>
-              <w:rPr>
-                <w:lang w:val="en-GB"/>
-              </w:rPr>
               <w:t xml:space="preserve">Date / meeting type</w:t>
             </w:r>
           </w:p>
@@ -137,9 +116,6 @@
               <w:pStyle w:val="Compact"/>
             </w:pPr>
             <w:r>
-              <w:rPr>
-                <w:lang w:val="en-GB"/>
-              </w:rPr>
               <w:t xml:space="preserve">Chair / note-taker / participants</w:t>
             </w:r>
           </w:p>
@@ -161,9 +137,6 @@
               <w:pStyle w:val="Compact"/>
             </w:pPr>
             <w:r>
-              <w:rPr>
-                <w:lang w:val="en-GB"/>
-              </w:rPr>
               <w:t xml:space="preserve">Target question and quantity: population, exposure/intervention, comparator, outcome, timing</w:t>
             </w:r>
           </w:p>
@@ -185,9 +158,6 @@
               <w:pStyle w:val="Compact"/>
             </w:pPr>
             <w:r>
-              <w:rPr>
-                <w:lang w:val="en-GB"/>
-              </w:rPr>
               <w:t xml:space="preserve">Diagram version / link</w:t>
             </w:r>
           </w:p>
@@ -209,9 +179,6 @@
               <w:pStyle w:val="Compact"/>
             </w:pPr>
             <w:r>
-              <w:rPr>
-                <w:lang w:val="en-GB"/>
-              </w:rPr>
               <w:t xml:space="preserve">Assumption register version / link</w:t>
             </w:r>
           </w:p>
@@ -233,9 +200,6 @@
               <w:pStyle w:val="Compact"/>
             </w:pPr>
             <w:r>
-              <w:rPr>
-                <w:lang w:val="en-GB"/>
-              </w:rPr>
               <w:t xml:space="preserve">SET version / link</w:t>
             </w:r>
           </w:p>
@@ -257,9 +221,6 @@
               <w:pStyle w:val="Compact"/>
             </w:pPr>
             <w:r>
-              <w:rPr>
-                <w:lang w:val="en-GB"/>
-              </w:rPr>
               <w:t xml:space="preserve">Framework adoption date and evidence already known</w:t>
             </w:r>
           </w:p>
@@ -281,9 +242,6 @@
         <w:pStyle w:val="Heading2"/>
       </w:pPr>
       <w:r>
-        <w:rPr>
-          <w:lang w:val="en-GB"/>
-        </w:rPr>
         <w:t xml:space="preserve">Four steps</w:t>
       </w:r>
     </w:p>
@@ -293,9 +251,6 @@
         <w:pStyle w:val="Heading3"/>
       </w:pPr>
       <w:r>
-        <w:rPr>
-          <w:lang w:val="en-GB"/>
-        </w:rPr>
         <w:t xml:space="preserve">1. Map evidence contributions</w:t>
       </w:r>
     </w:p>
@@ -322,9 +277,6 @@
               <w:pStyle w:val="Compact"/>
             </w:pPr>
             <w:r>
-              <w:rPr>
-                <w:lang w:val="en-GB"/>
-              </w:rPr>
               <w:t xml:space="preserve">Stream and outcome</w:t>
             </w:r>
           </w:p>
@@ -336,9 +288,6 @@
               <w:pStyle w:val="Compact"/>
             </w:pPr>
             <w:r>
-              <w:rPr>
-                <w:lang w:val="en-GB"/>
-              </w:rPr>
               <w:t xml:space="preserve">Estimate / finding and uncertainty, or pending</w:t>
             </w:r>
           </w:p>
@@ -350,9 +299,6 @@
               <w:pStyle w:val="Compact"/>
             </w:pPr>
             <w:r>
-              <w:rPr>
-                <w:lang w:val="en-GB"/>
-              </w:rPr>
               <w:t xml:space="preserve">Relationship / query and assumption IDs</w:t>
             </w:r>
           </w:p>
@@ -416,9 +362,6 @@
         <w:pStyle w:val="BodyText"/>
       </w:pPr>
       <w:r>
-        <w:rPr>
-          <w:lang w:val="en-GB"/>
-        </w:rPr>
         <w:t xml:space="preserve">Unmapped evidence / relationships without evidence:</w:t>
       </w:r>
     </w:p>
@@ -436,9 +379,6 @@
         <w:pStyle w:val="Heading3"/>
       </w:pPr>
       <w:r>
-        <w:rPr>
-          <w:lang w:val="en-GB"/>
-        </w:rPr>
         <w:t xml:space="preserve">2. Compare findings</w:t>
       </w:r>
     </w:p>
@@ -450,9 +390,10 @@
         <w:tblLook w:firstRow="1" w:lastRow="0" w:firstColumn="0" w:lastColumn="0" w:noHBand="0" w:noVBand="0" w:val="0020"/>
       </w:tblPr>
       <w:tblGrid>
-        <w:gridCol w:w="2640"/>
-        <w:gridCol w:w="2640"/>
-        <w:gridCol w:w="2640"/>
+        <w:gridCol w:w="1980"/>
+        <w:gridCol w:w="1980"/>
+        <w:gridCol w:w="1980"/>
+        <w:gridCol w:w="1980"/>
       </w:tblGrid>
       <w:tr>
         <w:trPr>
@@ -465,9 +406,6 @@
               <w:pStyle w:val="Compact"/>
             </w:pPr>
             <w:r>
-              <w:rPr>
-                <w:lang w:val="en-GB"/>
-              </w:rPr>
               <w:t xml:space="preserve">Relationship / query and streams</w:t>
             </w:r>
           </w:p>
@@ -479,9 +417,17 @@
               <w:pStyle w:val="Compact"/>
             </w:pPr>
             <w:r>
-              <w:rPr>
-                <w:lang w:val="en-GB"/>
-              </w:rPr>
+              <w:t xml:space="preserve">Causal alignment (target question / related question / different link) and integration level (A common effect / B related but non-identical / C different links)</w:t>
+            </w:r>
+          </w:p>
+        </w:tc>
+        <w:tc>
+          <w:tcPr/>
+          <w:p>
+            <w:pPr>
+              <w:pStyle w:val="Compact"/>
+            </w:pPr>
+            <w:r>
               <w:t xml:space="preserve">Comparability of populations, measures, timing, and estimands</w:t>
             </w:r>
           </w:p>
@@ -493,41 +439,54 @@
               <w:pStyle w:val="Compact"/>
             </w:pPr>
             <w:r>
-              <w:rPr>
-                <w:lang w:val="en-GB"/>
-              </w:rPr>
-              <w:t xml:space="preserve">Agreement / divergence and rationale</w:t>
-            </w:r>
-          </w:p>
-        </w:tc>
-      </w:tr>
-      <w:tr>
-        <w:tc>
-          <w:tcPr/>
-          <w:p>
-            <w:pPr>
-              <w:pStyle w:val="Compact"/>
-            </w:pPr>
-          </w:p>
-        </w:tc>
-        <w:tc>
-          <w:tcPr/>
-          <w:p>
-            <w:pPr>
-              <w:pStyle w:val="Compact"/>
-            </w:pPr>
-          </w:p>
-        </w:tc>
-        <w:tc>
-          <w:tcPr/>
-          <w:p>
-            <w:pPr>
-              <w:pStyle w:val="Compact"/>
-            </w:pPr>
-          </w:p>
-        </w:tc>
-      </w:tr>
-      <w:tr>
+              <w:t xml:space="preserve">Agreement / divergence / complementarity and rationale</w:t>
+            </w:r>
+          </w:p>
+        </w:tc>
+      </w:tr>
+      <w:tr>
+        <w:tc>
+          <w:tcPr/>
+          <w:p>
+            <w:pPr>
+              <w:pStyle w:val="Compact"/>
+            </w:pPr>
+          </w:p>
+        </w:tc>
+        <w:tc>
+          <w:tcPr/>
+          <w:p>
+            <w:pPr>
+              <w:pStyle w:val="Compact"/>
+            </w:pPr>
+          </w:p>
+        </w:tc>
+        <w:tc>
+          <w:tcPr/>
+          <w:p>
+            <w:pPr>
+              <w:pStyle w:val="Compact"/>
+            </w:pPr>
+          </w:p>
+        </w:tc>
+        <w:tc>
+          <w:tcPr/>
+          <w:p>
+            <w:pPr>
+              <w:pStyle w:val="Compact"/>
+            </w:pPr>
+          </w:p>
+        </w:tc>
+      </w:tr>
+      <w:tr>
+        <w:tc>
+          <w:tcPr/>
+          <w:p>
+            <w:pPr>
+              <w:pStyle w:val="Compact"/>
+            </w:pPr>
+          </w:p>
+        </w:tc>
         <w:tc>
           <w:tcPr/>
           <w:p>
@@ -561,9 +520,6 @@
         <w:pStyle w:val="Heading3"/>
       </w:pPr>
       <w:r>
-        <w:rPr>
-          <w:lang w:val="en-GB"/>
-        </w:rPr>
         <w:t xml:space="preserve">3. Examine bias</w:t>
       </w:r>
     </w:p>
@@ -590,9 +546,6 @@
               <w:pStyle w:val="Compact"/>
             </w:pPr>
             <w:r>
-              <w:rPr>
-                <w:lang w:val="en-GB"/>
-              </w:rPr>
               <w:t xml:space="preserve">Stream pair and relationship</w:t>
             </w:r>
           </w:p>
@@ -604,9 +557,6 @@
               <w:pStyle w:val="Compact"/>
             </w:pPr>
             <w:r>
-              <w:rPr>
-                <w:lang w:val="en-GB"/>
-              </w:rPr>
               <w:t xml:space="preserve">Shared / differing mechanisms and expected direction</w:t>
             </w:r>
           </w:p>
@@ -618,9 +568,6 @@
               <w:pStyle w:val="Compact"/>
             </w:pPr>
             <w:r>
-              <w:rPr>
-                <w:lang w:val="en-GB"/>
-              </w:rPr>
               <w:t xml:space="preserve">Implications for interpretation; confidence and rationale</w:t>
             </w:r>
           </w:p>
@@ -684,9 +631,6 @@
         <w:pStyle w:val="BodyText"/>
       </w:pPr>
       <w:r>
-        <w:rPr>
-          <w:lang w:val="en-GB"/>
-        </w:rPr>
         <w:t xml:space="preserve">Sensitivity analyses / unresolved uncertainty:</w:t>
       </w:r>
     </w:p>
@@ -704,16 +648,14 @@
         <w:pStyle w:val="Heading3"/>
       </w:pPr>
       <w:r>
-        <w:rPr>
-          <w:lang w:val="en-GB"/>
-        </w:rPr>
         <w:t xml:space="preserve">4. Revise and record</w:t>
       </w:r>
     </w:p>
     <w:tbl>
       <w:tblPr>
         <w:tblStyle w:val="Table"/>
-        <w:tblW w:type="auto" w:w="0"/>
+        <w:tblW w:type="pct" w:w="5000"/>
+        <w:tblLayout w:type="fixed"/>
         <w:tblLook w:firstRow="1" w:lastRow="0" w:firstColumn="0" w:lastColumn="0" w:noHBand="0" w:noVBand="0" w:val="0020"/>
       </w:tblPr>
       <w:tblGrid>
@@ -731,9 +673,6 @@
               <w:pStyle w:val="Compact"/>
             </w:pPr>
             <w:r>
-              <w:rPr>
-                <w:lang w:val="en-GB"/>
-              </w:rPr>
               <w:t xml:space="preserve">Field</w:t>
             </w:r>
           </w:p>
@@ -745,9 +684,6 @@
               <w:pStyle w:val="Compact"/>
             </w:pPr>
             <w:r>
-              <w:rPr>
-                <w:lang w:val="en-GB"/>
-              </w:rPr>
               <w:t xml:space="preserve">Response</w:t>
             </w:r>
           </w:p>
@@ -761,9 +697,6 @@
               <w:pStyle w:val="Compact"/>
             </w:pPr>
             <w:r>
-              <w:rPr>
-                <w:lang w:val="en-GB"/>
-              </w:rPr>
               <w:t xml:space="preserve">Trigger for reconsideration</w:t>
             </w:r>
           </w:p>
@@ -785,33 +718,27 @@
               <w:pStyle w:val="Compact"/>
             </w:pPr>
             <w:r>
-              <w:rPr>
-                <w:lang w:val="en-GB"/>
-              </w:rPr>
-              <w:t xml:space="preserve">Diagram / register change, or reason to retain the current version</w:t>
-            </w:r>
-          </w:p>
-        </w:tc>
-        <w:tc>
-          <w:tcPr/>
-          <w:p>
-            <w:pPr>
-              <w:pStyle w:val="Compact"/>
-            </w:pPr>
-          </w:p>
-        </w:tc>
-      </w:tr>
-      <w:tr>
-        <w:tc>
-          <w:tcPr/>
-          <w:p>
-            <w:pPr>
-              <w:pStyle w:val="Compact"/>
-            </w:pPr>
-            <w:r>
-              <w:rPr>
-                <w:lang w:val="en-GB"/>
-              </w:rPr>
+              <w:t xml:space="preserve">Diagram / register change (record edge status: supported / unsupported / uncertain / not adequately investigated), or reason to retain the current version</w:t>
+            </w:r>
+          </w:p>
+        </w:tc>
+        <w:tc>
+          <w:tcPr/>
+          <w:p>
+            <w:pPr>
+              <w:pStyle w:val="Compact"/>
+            </w:pPr>
+          </w:p>
+        </w:tc>
+      </w:tr>
+      <w:tr>
+        <w:tc>
+          <w:tcPr/>
+          <w:p>
+            <w:pPr>
+              <w:pStyle w:val="Compact"/>
+            </w:pPr>
+            <w:r>
               <w:t xml:space="preserve">Versions after meeting / decision-log reference</w:t>
             </w:r>
           </w:p>
@@ -833,33 +760,27 @@
               <w:pStyle w:val="Compact"/>
             </w:pPr>
             <w:r>
-              <w:rPr>
-                <w:lang w:val="en-GB"/>
-              </w:rPr>
-              <w:t xml:space="preserve">Conclusion and assumptions it depends on</w:t>
-            </w:r>
-          </w:p>
-        </w:tc>
-        <w:tc>
-          <w:tcPr/>
-          <w:p>
-            <w:pPr>
-              <w:pStyle w:val="Compact"/>
-            </w:pPr>
-          </w:p>
-        </w:tc>
-      </w:tr>
-      <w:tr>
-        <w:tc>
-          <w:tcPr/>
-          <w:p>
-            <w:pPr>
-              <w:pStyle w:val="Compact"/>
-            </w:pPr>
-            <w:r>
-              <w:rPr>
-                <w:lang w:val="en-GB"/>
-              </w:rPr>
+              <w:t xml:space="preserve">Conclusion, integration level chosen, and assumptions it depends on</w:t>
+            </w:r>
+          </w:p>
+        </w:tc>
+        <w:tc>
+          <w:tcPr/>
+          <w:p>
+            <w:pPr>
+              <w:pStyle w:val="Compact"/>
+            </w:pPr>
+          </w:p>
+        </w:tc>
+      </w:tr>
+      <w:tr>
+        <w:tc>
+          <w:tcPr/>
+          <w:p>
+            <w:pPr>
+              <w:pStyle w:val="Compact"/>
+            </w:pPr>
+            <w:r>
               <w:t xml:space="preserve">Relationships informed / untested</w:t>
             </w:r>
           </w:p>
@@ -881,9 +802,6 @@
               <w:pStyle w:val="Compact"/>
             </w:pPr>
             <w:r>
-              <w:rPr>
-                <w:lang w:val="en-GB"/>
-              </w:rPr>
               <w:t xml:space="preserve">Evidence that could change the conclusion</w:t>
             </w:r>
           </w:p>
@@ -905,9 +823,6 @@
               <w:pStyle w:val="Compact"/>
             </w:pPr>
             <w:r>
-              <w:rPr>
-                <w:lang w:val="en-GB"/>
-              </w:rPr>
               <w:t xml:space="preserve">Actions / owners / review dates</w:t>
             </w:r>
           </w:p>

</xml_diff>

<commit_message>
Publish framework updates and fix section links
</commit_message>
<xml_diff>
--- a/downloads/meeting-worksheet.docx
+++ b/downloads/meeting-worksheet.docx
@@ -417,18 +417,18 @@
               <w:pStyle w:val="Compact"/>
             </w:pPr>
             <w:r>
-              <w:t xml:space="preserve">Causal alignment (target question / related question / different link) and integration level (A common effect / B related but non-identical / C different links)</w:t>
-            </w:r>
-          </w:p>
-        </w:tc>
-        <w:tc>
-          <w:tcPr/>
-          <w:p>
-            <w:pPr>
-              <w:pStyle w:val="Compact"/>
-            </w:pPr>
-            <w:r>
-              <w:t xml:space="preserve">Comparability of populations, measures, timing, and estimands</w:t>
+              <w:t xml:space="preserve">Causal alignment — estimand identity between each stream-level estimand and the review target (target question / related question / different link) — and integration level (A common effect / B related but non-identical / C different links)</w:t>
+            </w:r>
+          </w:p>
+        </w:tc>
+        <w:tc>
+          <w:tcPr/>
+          <w:p>
+            <w:pPr>
+              <w:pStyle w:val="Compact"/>
+            </w:pPr>
+            <w:r>
+              <w:t xml:space="preserve">Within-stream applicability (indirectness): does each stream’s evidence apply to the population, measures, and timing its own estimand specifies?</w:t>
             </w:r>
           </w:p>
         </w:tc>

</xml_diff>